<commit_message>
Proofcheck Inn Trouble Swedish: SIGNIFICANT-borderline (6 fixes)
Co-Authored-By: Claude Opus 5.5 <noreply@anthropic.com>
Claude-Session: https://claude.ai/code/session_012Cm8JxdqzjuttdUSdkQCUg
</commit_message>
<xml_diff>
--- a/translated/corrected/Inn Trouble - ASSEMBLED - FORMATTED_Swedish.docx
+++ b/translated/corrected/Inn Trouble - ASSEMBLED - FORMATTED_Swedish.docx
@@ -4122,7 +4122,7 @@
     </w:p>
     <w:p>
       <w:r>
-        <w:t xml:space="preserve">"Hon hade det till godo," sa Neil medan han såg mig läsa. "Det är den biten som skvallret alltid utelämnar, eftersom skvallret vill ha en ren liten skurk och ett rent litet brott. Blackburns hade inte betalat sin hushållspersonal på månader, den vintern -24. Jag har klagomålen där i, de andra tjänarna som slutade, och ett brev, fru Claus, ett brev från Constance själv, där hon mycket artigt bad om sin innestående lön och till svar fick rådet att vara tacksam för att hon hade tak över huvudet. Hennes mor låg för döden samma vinter, tre gator bort, och det fanns inga pengar till en läkare, inga alls. Och där stod hon, dag efter dag, och dammade av en brosch värd mer än hon skulle tjäna under tre livstider, medan familjen som ägde den uppmanade henne att vara tacksam."</w:t>
+        <w:t xml:space="preserve">"Hon hade det till godo," sa Neil medan han såg mig läsa. "Det är den biten som skvallret alltid utelämnar, eftersom skvallret vill ha en ren liten skurk och ett rent litet brott. Blackburns hade inte betalat sin hushållspersonal på månader, den vintern -24. Jag har klagomålen där inne, de andra tjänarna som slutade, och ett brev, fru Claus, ett brev från Constance själv, där hon mycket artigt bad om sin innestående lön och till svar fick rådet att vara tacksam för att hon hade tak över huvudet. Hennes mor låg för döden samma vinter, tre gator bort, och det fanns inga pengar till en läkare, inga alls. Och där stod hon, dag efter dag, och dammade av en brosch värd mer än hon skulle tjäna under tre livstider, medan familjen som ägde den uppmanade henne att vara tacksam."</w:t>
       </w:r>
     </w:p>
     <w:p>
@@ -4181,7 +4181,7 @@
     <w:p/>
     <w:p>
       <w:r>
-        <w:t>Jag gick för att hjälpa Theo i arkivet den eftermiddagen, och jag gick i akt och mening att fria honom. Det var det hoppet jag bar uppför trappan och in genom dörren. Hitta orden i de försvunna breven, upptäcka att de inte stämde överens med lappen, dra ett streck över hans namn och gå hem lättare om hjärtat än när jag kom. Det var hela planen, och jag höll i den som ett brinnande ljus i blåsten, med båda händerna.</w:t>
+        <w:t>Jag gick för att hjälpa Theo i arkivet den eftermiddagen, och jag gick i akt och mening att rentvå honom. Det var det hoppet jag bar uppför trappan och in genom dörren. Hitta orden i de försvunna breven, upptäcka att de inte stämde överens med lappen, dra ett streck över hans namn och gå hem lättare om hjärtat än när jag kom. Det var hela planen, och jag höll i den som ett brinnande ljus i blåsten, med båda händerna.</w:t>
       </w:r>
     </w:p>
     <w:p/>
@@ -4223,7 +4223,7 @@
         <w:rPr>
           <w:i/>
         </w:rPr>
-        <w:t>Korrespondens, Adelaide Blackburn till hennes syster, vintern 1924. Angående stölden av familjebroschen (safiren i dess hjärta) av en husa; föremålet senare pantsatt i Ridgeline. Av betydande lokalt intresse.</w:t>
+        <w:t>Korrespondens, Adelaide Blackburn till sin syster, vintern 1924. Angående stölden av familjebroschen (safiren i dess hjärta) av en husa; föremålet senare pantsatt i Ridgeline. Av betydande lokalt intresse.</w:t>
       </w:r>
     </w:p>
     <w:p/>
@@ -5083,7 +5083,7 @@
     </w:p>
     <w:p>
       <w:r>
-        <w:t>"Jag har varit så rädd," sa hon. "I år ut och år in. För en sak som, om man berättar hela historien, inte ens är... hon var en flicka som försökte rädda sin mamma. Det var allt hon var. En flicka som försökte rädda sin mamma."</w:t>
+        <w:t>"Jag har varit så rädd," sa hon. "År ut och år in. För en sak som, om man berättar hela historien, inte ens är... hon var en flicka som försökte rädda sin mamma. Det var allt hon var. En flicka som försökte rädda sin mamma."</w:t>
       </w:r>
     </w:p>
     <w:p>
@@ -5255,7 +5255,7 @@
     <w:p/>
     <w:p>
       <w:r>
-        <w:t xml:space="preserve">"Vera," sa jag. "Theo stod för stölden. Men lapparna visste att värdshuset köptes för pengarna från broschen, och det stod aldrig i något Blackburnbrev. Det är ett fastighetsregister. Ett köpebrev. Och köpebrevet till det här värdshuset låg ute ur sin låda i din återarkiveringskorg i går morse, framtaget, på skrivbordet hos en kvinna som hade sagt till mig två gånger att hon aldrig läser handlingarna bakom ryggen på sig."</w:t>
+        <w:t xml:space="preserve">"Vera," sa jag. "Theo hade stölden. Men lapparna visste att värdshuset köptes för pengarna från broschen, och det stod aldrig i något Blackburnbrev. Det är ett fastighetsregister. Ett köpebrev. Och köpebrevet till det här värdshuset låg ute ur sin låda i din återarkiveringskorg i går morse, framtaget, på skrivbordet hos en kvinna som hade sagt till mig två gånger att hon aldrig läser handlingarna bakom ryggen på sig."</w:t>
       </w:r>
     </w:p>
     <w:p/>
@@ -5267,7 +5267,7 @@
     <w:p/>
     <w:p>
       <w:r>
-        <w:t>"Han stod för stölden. Du stod för köpebrevet. Och du hade benen, Vera. Han kunde inte korsa den här staden obemärkt om så hans liv hängde på det, alla känner Theo, alla hejdar honom. Men ingen reagerar på att borgmästarens sekreterare tittar förbi på värdshuset under festivalen. Jag mötte dig på trappan själv den morgonen, med dina parkeringstillstånd. Han kunde inte ha gjort det ensam. Han behövde någon som kunde röra sig genom staden osedd. Det var du."</w:t>
+        <w:t>"Han hade stölden. Du hade köpebrevet. Och du hade benen, Vera. Han kunde inte korsa den här staden obemärkt om så hans liv hängde på det, alla känner Theo, alla hejdar honom. Men ingen reagerar på att borgmästarens sekreterare tittar förbi på värdshuset under festivalen. Jag mötte dig på trappan själv den morgonen, med dina parkeringstillstånd. Han kunde inte ha gjort det ensam. Han behövde någon som kunde röra sig genom staden osedd. Det var du."</w:t>
       </w:r>
     </w:p>
     <w:p/>

</xml_diff>

<commit_message>
Full proofcheck Inn Trouble Swedish: MINOR (62 fixes)
Co-Authored-By: Claude Opus 5.5 <noreply@anthropic.com>
Claude-Session: https://claude.ai/code/session_012Cm8JxdqzjuttdUSdkQCUg
</commit_message>
<xml_diff>
--- a/translated/corrected/Inn Trouble - ASSEMBLED - FORMATTED_Swedish.docx
+++ b/translated/corrected/Inn Trouble - ASSEMBLED - FORMATTED_Swedish.docx
@@ -149,7 +149,7 @@
     </w:p>
     <w:p>
       <w:r>
-        <w:t>Pajen var fortfarande varm när jag lyfte ner den i korgen, tillräckligt varm för att ångan skulle imma igen insidan av det kalla köksfönstret, och hela rummet doftade av kanel, äpplen och det råsocker jag hade låtit gå en nyans förbi gyllene eftersom Fiona gillade det på det sättet. Hon hade sagt till mig en gång att hennes mor hade bränt sockret med vilje, precis till kanten, där det slutar vara sött och börjar bli något djupare. Doften av det, sa hon, var doften av att vara liten och trygg i ett varmt kök en koldag. Jag hade lagt till det åt henne på det sättet alltsedan dess.</w:t>
+        <w:t>Pajen var fortfarande varm när jag lyfte ner den i korgen, tillräckligt varm för att ångan skulle imma igen insidan av det kalla köksfönstret, och hela rummet doftade av kanel, äpplen och det råsocker jag hade låtit gå en nyans förbi gyllene eftersom Fiona gillade det på det sättet. Hon hade sagt till mig en gång att hennes mor hade bränt sockret med vilje, precis till kanten, där det slutar vara sött och börjar bli något djupare. Doften av det, sa hon, var doften av att vara liten och trygg i ett varmt kök en kall dag. Jag hade bakat den åt henne på det sättet alltsedan dess.</w:t>
       </w:r>
     </w:p>
     <w:p>
@@ -214,7 +214,7 @@
     </w:p>
     <w:p>
       <w:r>
-        <w:t>Hon stod bakom receptionen och snurrade på en penna varv efter varv. Fiona var en kvinna som skapats för munterhet. Hon var rund och snabb, snabb i vändningarna och ännu snabbare att skratta, med ett skratt som började djupt inifrån och kom på en gång. Munterheten hade gått ur henne som värmen ur ett rum med öppen dörr. Det fanns skuggor under hennes ögon som inte pudret hade döljt. Hennes kofta var knäppt fel med en knapp. När hon fick syn på mig gjorde hon det som oroade mig mer än skuggorna: hon ordnade till sitt ansikte. Hon tog på sig välkomnandet, medvetet, som en kvinna som tar på sig en kappa hon är för trött för att bära, och kom runt disken mot mig.</w:t>
+        <w:t>Hon stod bakom receptionen och snurrade på en penna varv efter varv. Fiona var en kvinna som skapats för munterhet. Hon var rund och snabb, snabb i vändningarna och ännu snabbare att skratta, med ett skratt som började djupt inifrån och kom på en gång. Munterheten hade gått ur henne som värmen ur ett rum med öppen dörr. Det fanns skuggor under hennes ögon som inte pudret hade dolt. Hennes kofta var knäppt fel med en knapp. När hon fick syn på mig gjorde hon det som oroade mig mer än skuggorna: hon ordnade till sitt ansikte. Hon tog på sig välkomnandet, medvetet, som en kvinna som tar på sig en kappa hon är för trött för att bära, och kom runt disken mot mig.</w:t>
       </w:r>
     </w:p>
     <w:p>
@@ -339,7 +339,7 @@
     </w:p>
     <w:p>
       <w:r>
-        <w:t>"Claus." Han log, och det var ett gott leende, avspänt och inövat, men jag litade på det ungefär lika mycket som jag skulle ha kunnat kasta gnistskyddet. "Då är du den berömda fru Claus. Så otroligt underbart. Jag hade hört det, naturligtvis, man hör ju en del, men jag trodde inte riktigt på det förrän nu." Han lutade sig fram en aning förtroligt. "Säg mig. De gamla familjerna här, Blackburn och de andra, finns deras tillhörigheter kvar i stan? Arvegods, möbler, smycken, sådant där? Jag råkar nämligen spåra ett föremål. En brosch."</w:t>
+        <w:t>"Claus." Han log, och det var ett gott leende, avspänt och inövat, men jag litade på det ungefär lika långt som jag hade kunnat kasta gnistskyddet. "Då är du den berömda fru Claus. Så otroligt underbart. Jag hade hört det, naturligtvis, man hör ju en del, men jag trodde inte riktigt på det förrän nu." Han lutade sig fram en aning förtroligt. "Säg mig. De gamla familjerna här, Blackburn och de andra, finns deras tillhörigheter kvar i stan? Arvegods, möbler, smycken, sådant där? Jag råkar nämligen spåra ett föremål. En brosch."</w:t>
       </w:r>
     </w:p>
     <w:p>
@@ -539,7 +539,7 @@
     </w:p>
     <w:p>
       <w:r>
-        <w:t xml:space="preserve">Det var en lapp. Handstilen var medvetet dålig, full av ojämna snedstreck och brutna bokstäver, den omsorgsfulla klumpighet som uppstår när någon anstränger sig hårt för att dölja sin stil. Summan var det första jag såg, eftersom den som hade skrivit den hade velat att summan skulle vara det första alla fick se. Femhundra tusen dollar. Och därunder, i samma mödosamma kråkfötter, resten av det. </w:t>
+        <w:t xml:space="preserve">Det var en lapp. Handstilen var medvetet dålig, full av ojämna snedstreck och brutna bokstäver, den omsorgsfulla klumpighet som uppstår när någon anstränger sig hårt för att dölja sin stil. Summan var det första jag såg, eftersom den som hade skrivit den hade velat att summan skulle vara det första alla fick se. Femhundratusen dollar. Och därunder, i samma mödosamma kråkfötter, resten av det. </w:t>
       </w:r>
       <w:r>
         <w:rPr>
@@ -565,7 +565,7 @@
     </w:p>
     <w:p>
       <w:r>
-        <w:t>Jag tittade. Fotografiet föreställde en kvinna i kläder från för hundra år sedan, smal och allvarlig, det mörka håret ondulerat tätt intill huvudet i tjugotalsstil, hakan höjd, blicken mötte kameran rakt på sak med något i sig som varken var ett leende eller en utmaning men nära släkt med båda. Hon bar en höghalsad klänning, och vid halsen, fastnålad precis under kragen, satt en brosch. Till och med i den mjuka bruna bilden syntes det att det var ett fint föremål, guld som arbetats i en invecklad fattning runt en enda stor sten som den gamla filmen hade fångat som ett blekgrått sken.</w:t>
+        <w:t>Jag tittade. Fotografiet föreställde en kvinna i kläder från för hundra år sedan, smal och allvarlig, det mörka håret ondulerat tätt intill huvudet i tjugotalsstil, hakan höjd, blicken mötte kameran rakt på med något i sig som varken var ett leende eller en utmaning men nära släkt med båda. Hon bar en höghalsad klänning, och vid halsen, fastnålad precis under kragen, satt en brosch. Till och med i den mjuka bruna bilden syntes det att det var ett fint föremål, guld som arbetats i en invecklad fattning runt en enda stor sten som den gamla filmen hade fångat som ett blekgrått sken.</w:t>
       </w:r>
     </w:p>
     <w:p>
@@ -679,7 +679,7 @@
     </w:p>
     <w:p>
       <w:r>
-        <w:t>"Ta dem." Hon släppte ut ett andetag som nästan var ett skratt, den genomslitna sorten som inte har någon munterhet kvar i sig. "Ta dem, och snälla, Jessica, snälla få det att upphöra. Jag har legat vaken varje natt och räknat i mörkret. Jag har den inte. Femhundra tusen dollar. Jag har inte en tiondel av det. Jag har ett värdshus fyllt av kärlek, en bunt räkningar i kontorslådan och familjen Worthingtons goda vecka. Det är allt jag har i den här världen."</w:t>
+        <w:t>"Ta dem." Hon släppte ut ett andetag som nästan var ett skratt, den genomslitna sorten som inte har någon munterhet kvar i sig. "Ta dem, och snälla, Jessica, snälla få det att upphöra. Jag har legat vaken varje natt och räknat i mörkret. Jag har den inte. Femhundratusen dollar. Jag har inte en tiondel av det. Jag har ett värdshus fyllt av kärlek, en bunt räkningar i kontorslådan och familjen Worthingtons goda vecka. Det är allt jag har i den här världen."</w:t>
       </w:r>
     </w:p>
     <w:p>
@@ -829,7 +829,7 @@
     </w:p>
     <w:p>
       <w:r>
-        <w:t>"Vad bygger du där ute?" frågade jag honom medan jag torkade händerna. Jag hade frågat förut. Han hade hållit på med det i veckor nu, gått iväg efter kvällsmaten med en lykta, gnolad på något och kommit in sent med doft av nysågad furu och något varmare som jag inte kunde sätta fingret på.</w:t>
+        <w:t>"Vad bygger du där ute?" frågade jag honom medan jag torkade händerna. Jag hade frågat förut. Han hade hållit på med det i veckor nu, gått iväg efter kvällsmaten med en lykta, gnolat på något och kommit in sent med doft av nysågad furu och något varmare som jag inte kunde sätta fingret på.</w:t>
       </w:r>
     </w:p>
     <w:p>
@@ -929,7 +929,7 @@
     </w:p>
     <w:p>
       <w:r>
-        <w:t>Vi stod där en stund till och tittade på den gyllene staden, och sedan gick vi upp och lade oss. Jag låg vaken en god stund i mörkret och bar på två saker samtidigt. Någonstans nere i Frost Falls hade en person stått bland Blackburns lådor och hittat ett sätt att lägga handen om halsen på en hederlig kvinna för en halv miljon dollar. Och bortom hagen byggde min make en överraskning som han vägrade namnge, medan lamporna blev gula av sig själva och den magi vi hade tagit med oss gick på jakt genom mörkret efter en plats att landa på.</w:t>
+        <w:t>Vi stod där en stund till och tittade på den gyllene staden, och sedan gick vi upp och lade oss. Jag låg vaken en god stund i mörkret och bar på två saker samtidigt. Någonstans nere i Frost Falls hade en person stått bland Blackburns lådor och hittat ett sätt att lägga handen om halsen på en hederlig kvinna för en halv miljon dollar. Och bortom hagen byggde min make en överraskning som han vägrade namnge, medan lamporna blev gyllene av sig själva och den magi vi hade tagit med oss gick på jakt genom mörkret efter en plats att landa på.</w:t>
       </w:r>
     </w:p>
     <w:p>
@@ -1315,12 +1315,12 @@
     </w:p>
     <w:p>
       <w:r>
-        <w:t>"Vi kommer inte att bli klara i tid," sa hon, inte missnöjt, snarare som ett rent konstaterande, vilket hon gjorde med allt. "Inte när festivalen är framflyttad till nästa helg."</w:t>
-      </w:r>
-    </w:p>
-    <w:p>
-      <w:r>
-        <w:t>"Den är inte framflyttad," sa Dot utan att lyfta blicken från sitt arbete. "Det är sista helgen i oktober, precis som det har varit sedan innan du föddes. Det är bara du som är långsam."</w:t>
+        <w:t>"Vi kommer inte att bli klara i tid," sa hon, inte missnöjt, snarare som ett rent konstaterande, vilket hon gjorde med allt. "Inte när festivalen är tidigarelagd till nästa helg."</w:t>
+      </w:r>
+    </w:p>
+    <w:p>
+      <w:r>
+        <w:t>"Den är inte tidigarelagd," sa Dot utan att lyfta blicken från sitt arbete. "Det är sista helgen i oktober, precis som det har varit sedan innan du föddes. Det är bara du som är långsam."</w:t>
       </w:r>
     </w:p>
     <w:p>
@@ -1560,12 +1560,12 @@
     </w:p>
     <w:p>
       <w:r>
-        <w:t>Fem hundra tusen dollar, krävda av en kvinna som inte ens ägde en tiondel av det, av någon som visste exakt hur en förmögenhet kunde trollas fram ur en gammal hemlighet. En byggnad full av stadens minne som slocknade för brist på en bråkdel av samma summa. Och en god, gråblek man som inte hade några ärliga dörrar kvar att knacka på.</w:t>
-      </w:r>
-    </w:p>
-    <w:p>
-      <w:r>
-        <w:t>Jag ville inte att det skulle vara Theo. Jag gick hem den eftermiddagen och ville av hela mitt hjärta att det skulle visa sig vara vem som helst annan i världen.</w:t>
+        <w:t>Femhundratusen dollar, krävda av en kvinna som inte ens ägde en tiondel av det, av någon som visste exakt hur en förmögenhet kunde trollas fram ur en gammal hemlighet. En byggnad full av stadens minne som slocknade för brist på en bråkdel av samma summa. Och en god, gråblek man som inte hade några ärliga dörrar kvar att knacka på.</w:t>
+      </w:r>
+    </w:p>
+    <w:p>
+      <w:r>
+        <w:t>Jag ville inte att det skulle vara Theo. Jag gick hem den eftermiddagen och ville av hela mitt hjärta att det skulle visa sig vara vem som helst annars i världen.</w:t>
       </w:r>
     </w:p>
     <w:p>
@@ -1636,7 +1636,7 @@
     </w:p>
     <w:p>
       <w:r>
-        <w:t>"Hon har tjatat på mig i en vecka om att få fråga om pingvinen kom till festivalen," sa han. "Jag tror att vad Emma beträffar är Pip hela festivalen. Resten är bara det som måste hända för att pingvinen ska dyka upp."</w:t>
+        <w:t>"Hon har tjatat på mig i en vecka om att jag skulle fråga om pingvinen skulle komma till festivalen," sa han. "Jag tror att vad Emma beträffar är Pip hela festivalen. Resten är bara det som måste hända för att pingvinen ska dyka upp."</w:t>
       </w:r>
     </w:p>
     <w:p>
@@ -1718,7 +1718,7 @@
     </w:p>
     <w:p>
       <w:r>
-        <w:t>Jag gick dit och tittade. Ur det blöta, orangea fruktköttet, den sista veckan i oktober, hade en kvist järnek skjutit upp: tre mörka, glansiga blad, skarpkantade och omisskännliga, och bland dem tre röda bär runda som blodsdroppar, som växte fram ur en förstörd Halloweenpumpa den timmen sedan Pip hade slitit upp den.</w:t>
+        <w:t>Jag gick dit och tittade. Ur det blöta, orangea fruktköttet, den sista veckan i oktober, hade en kvist järnek skjutit upp: tre mörka, glansiga blad, skarpkantade och omisskännliga, och bland dem tre röda bär runda som blodsdroppar, som växte fram ur en förstörd Halloweenpumpa under den timme som gått sedan Pip hade slitit upp den.</w:t>
       </w:r>
     </w:p>
     <w:p>
@@ -1808,7 +1808,7 @@
     <w:p/>
     <w:p>
       <w:r>
-        <w:t>Vi tog med oss soppan in i det lilla sällskapsrummet och hon åt, och jag iakttog henne när hon åt. Jag hade för längesen lärt mig att man kan utläsa mycket om hur en person mår av huruvida hen kommer ihåg att smaka på maten. Fiona hade slutat att smaka på sin någon gång under de senaste veckorna. Hon åt första halvan av skålen som vore den medicin, snabbt och utan att se vad hon gjorde. Sedan, någonstans i mitten, saktade hon in och kände efter. Hennes axlar sjönk en aning, och jag visste att soppan hjälpte.</w:t>
+        <w:t>Vi tog med oss soppan in i det lilla sällskapsrummet och hon åt, och jag iakttog henne när hon åt. Jag hade för längesen lärt mig att man kan utläsa mycket om hur en person mår av huruvida hen kommer ihåg att smaka på maten. Fiona hade slutat att smaka på sin någon gång under de senaste veckorna. Hon åt första halvan av skålen som vore den medicin, snabbt och utan att se vad hon gjorde. Sedan, någonstans i mitten, saktade hon in och smakade. Hennes axlar sjönk en aning, och jag visste att soppan hjälpte.</w:t>
       </w:r>
     </w:p>
     <w:p/>
@@ -1999,7 +1999,7 @@
     <w:p/>
     <w:p>
       <w:r>
-        <w:t>Och medan jag beundrade den andades jag in smedjan, och där var den, omisskännlig, den exakta lukt som klamrade sig fast vid ett ark krämfärgat papper vikt i min kappa. Den fanns på lappen, och den fanns här. Och jag tvingade mig att ta det lugnt, tvingade mig att hålla kolet i min öppna hand och inte knyta näven om det, för en lukt är inte en bekännelse. Sam Patel hade efter vad alla sagt varit rak och renhårig mot hela den här staden i tio år, och jag hade kommit för att titta, inte för att döma.</w:t>
+        <w:t>Och medan jag beundrade den andades jag in smedjan, och där var den, omisskännlig, den exakta lukt som klamrade sig fast vid ett ark krämfärgat papper vikt i min kappa. Den fanns på lappen, och den fanns här. Och jag tvingade mig att ta det lugnt, tvingade mig att hålla glöden i min öppna hand och inte knyta näven om den, för en lukt är inte en bekännelse. Sam Patel hade efter vad alla sagt varit rak och renhårig mot hela den här staden i tio år, och jag hade kommit för att titta, inte för att döma.</w:t>
       </w:r>
     </w:p>
     <w:p/>
@@ -2179,7 +2179,7 @@
     <w:p/>
     <w:p>
       <w:r>
-        <w:t>Jag blev alldeles stilla inom mig. Hela foajén var genomdränkt av hans järn och andedräkten från hans eld, tjock som lukten av hundra middagar i ett kök. Vad som än lämnades i den foajén, vad som än sattes ner på receptionen eller stacks in under en dörr eller burits i en ficka över det golvet, skulle dofta av Sam Patels smedja.</w:t>
+        <w:t>Jag blev alldeles stilla inom mig. Hela foajén var genomdränkt av hans järn och andedräkten från hans eld, tjock som lukten av hundra middagar i ett kök. Vad som än lämnades i den foajén, vad som än sattes ner på receptionen eller stacks in under en dörr eller bars i en ficka över det golvet, skulle dofta av Sam Patels smedja.</w:t>
       </w:r>
     </w:p>
     <w:p/>
@@ -2298,7 +2298,7 @@
     <w:p/>
     <w:p>
       <w:r>
-        <w:t xml:space="preserve">"Släktutredningar. Det är mitt yrke, fru Claus. När den sista i en gammal penningstark ätt dör efterlämnar den en röra, en trasselhärva av vem som ägde vad, vem som var skyldig vad, vart något värdefullt föremål har tagit vägen, och någon måste sitta på bibliotek och reda ut trasslet, och den som gör det är jag."</w:t>
+        <w:t xml:space="preserve">"Dödsboutredningar. Det är mitt yrke, fru Claus. När den sista i en gammal penningstark ätt dör efterlämnar den en röra, en trasselhärva av vem som ägde vad, vem som var skyldig vad, vart något värdefullt föremål har tagit vägen, och någon måste sitta på bibliotek och reda ut trasslet, och den som gör det är jag."</w:t>
       </w:r>
     </w:p>
     <w:p/>
@@ -2523,7 +2523,7 @@
     </w:p>
     <w:p>
       <w:r>
-        <w:t>"Fru Claus!" Bram rundade stugknuten i trav och vred om sin mössa i händerna. Bram var alven som följt med oss söderut, förmannen för den flyttade verkstaden, hängiven, omständlig och byggd i stora drag som en bekymrad potatis, och han var nu i högform av ängslan. "Det är Dancer. Hon har släppt ut sig igen. Tredje gången den här veckan, fru Claus, den tredje. Och jag svär på varenda knapp jag äger att den grinden var reglad när jag gick därifrån, reglad och prövad, och nu står hon här och äter opp det goda kålet och vägrar låta sig ledas, och jag tycker inte om hur något av det här ser ut, det vill jag lova."</w:t>
+        <w:t>"Fru Claus!" Bram rundade stugknuten i trav och vred om sin mössa i händerna. Bram var alven som följt med oss söderut, förmannen för den flyttade verkstaden, hängiven, omständlig och byggd i stora drag som en bekymrad potatis, och han var nu i högform av ängslan. "Det är Dancer. Hon har släppt ut sig igen. Tredje gången den här veckan, fru Claus, den tredje. Och jag svär på varenda knapp jag äger att den grinden var reglad när jag gick därifrån, reglad och prövad, och nu står hon här och äter opp den goda kålen och vägrar låta sig ledas, och jag tycker inte om hur något av det här ser ut, det vill jag lova."</w:t>
       </w:r>
     </w:p>
     <w:p>
@@ -2592,7 +2592,7 @@
     </w:p>
     <w:p>
       <w:r>
-        <w:t>"Den följde med oss ner," sa han. "Magin. Du känner till den biten. Den tillhörde aldrig Polen, Polen var bara platsen där den vilade. En härd som den hade nött slät under mycket lång tid, en plats att vara på. Och vi gav oss av, och den följde med, eftersom den är vår, eller vi är dess, jag har aldrig varit säker på vilket håll det där går. Och här har den ingen härd. Ingen nött plats att slå sig till ro på. Så den slår gnistor." Han nickade ut mot staden där nedanför, där festivallamporna började tändas längs de bortre takåsarna, gyllene där de borde ha varit orangea. "Små saker, mestadels. Ljus som ändrar färg. En regel som slår igen av sig själv. En pumpa som börjar växa järnek. Den gör ingen skada, Jess. Den vet inte hur man gör skada. Den är som en hund som har tappat bort sin människa, som går från dörr till dörr längs hela gatan och är hoppfull vid varenda en."</w:t>
+        <w:t>"Den följde med oss ner," sa han. "Magin. Du känner till den biten. Den tillhörde aldrig Polen, Polen var bara platsen där den vilade. En eldstad som den hade nött slät under mycket lång tid, en plats att vara på. Och vi gav oss av, och den följde med, eftersom den är vår, eller vi är dess, jag har aldrig varit säker på vilket håll det där går. Och här har den ingen eldstad. Ingen nött plats att slå sig till ro på. Så den slår gnistor." Han nickade ut mot staden där nedanför, där festivallamporna började tändas längs de bortre takåsarna, gyllene där de borde ha varit orangea. "Små saker, mestadels. Ljus som ändrar färg. En regel som slår igen av sig själv. En pumpa som börjar växa järnek. Den gör ingen skada, Jess. Den vet inte hur man gör skada. Den är som en hund som har tappat bort sin människa, som går från dörr till dörr längs hela gatan och är hoppfull vid varenda en."</w:t>
       </w:r>
     </w:p>
     <w:p>
@@ -2613,7 +2613,7 @@
     <w:p/>
     <w:p>
       <w:r>
-        <w:t>Han var tyst en stund, våra andetag immade skymningen. "Det är en plats för den att sitta på," sa han till slut med låg röst. "Det är allt jag säger, och till och med det är mer än jag borde, eftersom den inte är färdig, och jag vet inte om den kommer att hålla. Jag försöker bygga det som den letar efter, Jess. En härd. Så att den slutar gå från dörr till dörr i mörkret och kommer hem och lägger sig." Han kramade min hand. "Berätta det inte för någon. Inte för att det är en hemlighet att hålla för sig själv. Utan för att jag inte vill säga det högt förrän jag vet att det fungerar."</w:t>
+        <w:t>Han var tyst en stund, våra andetag immade skymningen. "Det är en plats för den att sitta på," sa han till slut med låg röst. "Det är allt jag säger, och till och med det är mer än jag borde, eftersom den inte är färdig, och jag vet inte om den kommer att hålla. Jag försöker bygga det som den letar efter, Jess. En eldstad. Så att den slutar gå från dörr till dörr i mörkret och kommer hem och lägger sig." Han kramade min hand. "Berätta det inte för någon. Inte för att det är en hemlighet att hålla för sig själv. Utan för att jag inte vill säga det högt förrän jag vet att det fungerar."</w:t>
       </w:r>
     </w:p>
     <w:p/>
@@ -2646,7 +2646,7 @@
     <w:p/>
     <w:p>
       <w:r>
-        <w:t>Ljusen brann i guld över Frost Falls, och bortom hagen byggde min man en härd för en hemlös magi. Jag stod kvar en stund till i mitt varma kök med tyngden av mitt långa liv vilande över mig. Sedan återgick jag till arbetet.</w:t>
+        <w:t>Ljusen brann i guld över Frost Falls, och bortom hagen byggde min man en eldstad för en hemlös magi. Jag stod kvar en stund till i mitt varma kök med tyngden av mitt långa liv vilande över mig. Sedan återgick jag till arbetet.</w:t>
       </w:r>
     </w:p>
     <w:p>
@@ -2662,7 +2662,7 @@
     </w:p>
     <w:p>
       <w:r>
-        <w:t>I foajén hängde porträtt av gångna borgmästare i förgyllda ramar och med ett självbelåtet uttryck, och förvånansvärt många av dem var Blackburns; samma långa Blackburn-näsa hade gått i arv längs väggen som vore den ett ståndsmässigt familjesilver. Längst bort i foajén stod den nuvarande borgmästarens dörr på glänt. Bakom ett brett och rent skrivbord som inte rymde något annat än en telefon och ett läderunderlägg satt borgmästaren själv, en slätstruken, gråhårig man som hade ärvt näsan, ämbetet och – såvitt någon i staden kunde bedöma – föga annat.</w:t>
+        <w:t>I foajén hängde porträtt av gångna borgmästare i förgyllda ramar och med ett självbelåtet uttryck, och förvånansvärt många av dem var Blackburns; samma långa Blackburn-näsa hade gått i arv längs väggen som vore den ett ståndsmässigt familjesilver. Längst bort i foajén stod den nuvarande borgmästarens dörr öppen. Bakom ett brett och rent skrivbord som inte rymde något annat än en telefon och ett läderunderlägg satt borgmästaren själv, en slätstruken, gråhårig man som hade ärvt näsan, ämbetet och – såvitt någon i staden kunde bedöma – föga annat.</w:t>
       </w:r>
     </w:p>
     <w:p>
@@ -2831,7 +2831,7 @@
     </w:p>
     <w:p>
       <w:r>
-        <w:t>Jag visste inte vad det innebar. Det kunde betyda inget annat än en trött kvinna som inte uppskattade snokande frågor en lång dag. Men min vädjan för Sällskapet hade misslyckats, precis som Dot hade förutspått att den skulle göra, och Sällskapet var fortfarande på väg att släckas ned. Och nu fanns det två personer i Frost Falls som jag inte kunde höra namnet Blackburn utan att tänka på. Den ene drev det arkiv dit breven hade försvunnit.</w:t>
+        <w:t>Jag visste inte vad det innebar. Det kunde betyda inget annat än en trött kvinna som inte uppskattade snokande frågor en lång dag. Men min vädjan för Sällskapet hade misslyckats, precis som Dot hade förutspått att den skulle göra, och Sällskapet var fortfarande på väg att släckas ned. Och nu fanns det två personer i Frost Falls som jag inte kunde höra namnet Blackburn utan att tänka på. Den ene drev det arkiv där breven hade försvunnit.</w:t>
       </w:r>
     </w:p>
     <w:p>
@@ -3065,7 +3065,7 @@
     <w:p/>
     <w:p>
       <w:r>
-        <w:t>Jag begrundade det på samma sätt som jag hade begrundat Sams tjugodollarsedel. Här var en man djupt skuldtyngd, med alla tänkbara skäl i världen och dessutom alla möjligheter. Hans svar på det var att stå vakt över stadens festival hela natten för en blygsam ersättning och lära mormödrar att göra utfallsteg klockan halv sex på morgonen. Jamal jobbade tre jobb för att ta sig ur sin knipa på det hederliga, utmattande sättet, bit för bit, och det gick inte ihop med en utpressningslapp på en halv miljon dollar. Matematiken stämde helt enkelt inte. Om Jamal Washington hade haft minsta lilla chans att trolla fram den sortens summor ur någon hemlighet, skulle han inte ställa klockan på fem.</w:t>
+        <w:t>Jag begrundade det på samma sätt som jag hade begrundat Sams tjugo dollar. Här var en man djupt skuldtyngd, med alla tänkbara skäl i världen och dessutom alla möjligheter. Hans svar på det var att stå vakt över stadens festival hela natten för en blygsam ersättning och lära mormödrar att göra utfallsteg klockan halv sex på morgonen. Jamal jobbade tre jobb för att ta sig ur sin knipa på det hederliga, utmattande sättet, bit för bit, och det gick inte ihop med en utpressningslapp på en halv miljon dollar. Matematiken stämde helt enkelt inte. Om Jamal Washington hade haft minsta lilla chans att trolla fram den sortens summor ur någon hemlighet, skulle han inte ställa klockan på fem.</w:t>
       </w:r>
     </w:p>
     <w:p/>
@@ -3101,10 +3101,10 @@
         <w:rPr>
           <w:i/>
         </w:rPr>
-        <w:t>försiktigt nu, försiktigt, den där är skör</w:t>
-      </w:r>
-      <w:r>
-        <w:t>, och jag bar den sköra lådan dit han pekade och gick rakt tillbaka efter nästa sköra låda."</w:t>
+        <w:t>försiktigt nu, försiktigt, den där är dyrbar</w:t>
+      </w:r>
+      <w:r>
+        <w:t>, och jag bar den dyrbara lådan dit han pekade och gick rakt tillbaka efter nästa dyrbara låda."</w:t>
       </w:r>
     </w:p>
     <w:p/>
@@ -3122,7 +3122,7 @@
     <w:p/>
     <w:p>
       <w:r>
-        <w:t>Han sa det lättsamt, helt ovetande om att han faktiskt hade gett mig ett svar, och jag höll masken medan det lilla, rena klicket ljöd inom mig. Han hade inte läst breven. Han hade burit lådorna med blicken fäst på fötterna. Vad utpressaren än hade läst i Blackburns papper – broschen, stenen, pantlåneaffären – Jamal hade aldrig haft det framför ögonen. Han hade haft det i famnen, instängt i en låda, och aldrig kikat in.</w:t>
+        <w:t>Han sa det lättsamt, helt ovetande om att han faktiskt hade gett mig ett svar, och jag höll masken medan det lilla, rena klicket ljöd inom mig. Han hade inte läst breven. Han hade burit lådorna med blicken fäst på fötterna. Vad utpressaren än hade läst i Blackburns papper – broschen, stenen, pantbanken – Jamal hade aldrig haft det framför ögonen. Han hade haft det i famnen, instängt i en låda, och aldrig kikat in.</w:t>
       </w:r>
     </w:p>
     <w:p/>
@@ -3176,7 +3176,7 @@
     <w:p/>
     <w:p>
       <w:r>
-        <w:t>Han var fri. Vissheten om saken slog rot inom mig, och den åstadkom två saker på en gång. Den skänkte mig lättnad, för jag tyckte om Jamal och ville inte att det skulle vara han.</w:t>
+        <w:t>Han var utom misstanke. Vissheten om saken slog rot inom mig, och den åstadkom två saker på en gång. Den skänkte mig lättnad, för jag tyckte om Jamal och ville inte att det skulle vara han.</w:t>
       </w:r>
     </w:p>
     <w:p/>
@@ -3432,7 +3432,7 @@
     <w:p/>
     <w:p>
       <w:r>
-        <w:t>"Hon vet vad som finns där i," sa Olivia.</w:t>
+        <w:t>"Hon vet vad som finns där inne," sa Olivia.</w:t>
       </w:r>
     </w:p>
     <w:p/>
@@ -3444,7 +3444,7 @@
     <w:p/>
     <w:p>
       <w:r>
-        <w:t>Ivy berättade historien om fontänen. Hon hade fått den återberättad av herr Kim, som hade sett hela spektaklet från sin campingstol. I Ivys version hade Prancer befunnit sig i fontänen ända sedan gryningen, och Bram hade gått i efter henne upp till armhålorna.</w:t>
+        <w:t>Ivy berättade historien om fontänen. Hon hade fått den återberättad av herr Kim, som hade sett hela spektaklet från sin fällstol. I Ivys version hade Prancer befunnit sig i fontänen ända sedan gryningen, och Bram hade gått i efter henne upp till armhålorna.</w:t>
       </w:r>
     </w:p>
     <w:p/>
@@ -3480,7 +3480,7 @@
     <w:p/>
     <w:p>
       <w:r>
-        <w:t>"Morgondagens tidning. Sidan tre." Claire lyfte inte blicken från sina stickor. "De röstade för att hålla dörrarna öppna till januari, och efter det är det ingen som vet. Jag satt igenom två timmar av det. Theo satt och bad om ursäkt för taket hela tiden, som om han hade gjort hålet själv."</w:t>
+        <w:t>"Morgondagens tidning. Sidan tre." Claire lyfte inte blicken från sina stickor. "De röstade för att hålla dörrarna öppna till januari, och efter det är det ingen som vet. Jag satt där i två timmar. Theo satt och bad om ursäkt för taket hela tiden, som om han hade gjort hålet själv."</w:t>
       </w:r>
     </w:p>
     <w:p/>
@@ -3677,7 +3677,7 @@
     <w:p/>
     <w:p>
       <w:r>
-        <w:t>"Jamal bar lådorna men öppnade aldrig en enda," sa jag. "Det sa han själv till mig, och jag tror på det. Hela hans historiska lärdom gick ut på ’försiktigt, det där är ömtåligt’. Han höll händerna på utsidan av hemligheten hela veckan och tittade aldrig in i den. Och karln har tre jobb för att ta sig ur sin knipa på ärligt vis, både träningspasset halv sex och nattvakten. Det är inte han."</w:t>
+        <w:t>"Jamal bar lådorna men öppnade aldrig en enda," sa jag. "Det sa han själv till mig, och jag tror på det. Hela hans historiska lärdom gick ut på ’försiktigt, det där är dyrbart’. Han höll händerna på utsidan av hemligheten hela veckan och tittade aldrig in i den. Och karln har tre jobb för att ta sig ur sin knipa på ärligt vis, både träningspasset halv sex och nattvakten. Det är inte han."</w:t>
       </w:r>
     </w:p>
     <w:p/>
@@ -3773,7 +3773,7 @@
     <w:p/>
     <w:p>
       <w:r>
-        <w:t>"Jag är inte beredd att skriva av honom. Men jag ska säga så här. Han kan hemligheten, och han kom över den på ärligt vis, och han har aldrig gått till Fiona för en enda slant. Han har gått till henne för att få svar, i dagsljus, med ett anteckningsblock i handen."</w:t>
+        <w:t>"Jag är inte beredd att skriva av honom. Men jag ska säga så här. Han känner till hemligheten, och han kom över den på ärligt vis, och han har aldrig gått till Fiona för en enda slant. Han har gått till henne för att få svar, i dagsljus, med ett anteckningsblock i handen."</w:t>
       </w:r>
     </w:p>
     <w:p/>
@@ -4022,7 +4022,7 @@
     </w:p>
     <w:p>
       <w:r>
-        <w:t>"Ett riktigt företag," sa hon innan jag ens hann få fram ett hej. "Gammalt, två delstater bort, gör det din man säger att det gör, bouppteckningar och dödsbon och efterforskning av förlorad egendom åt advokater som har mer pengar än tid. Och det finns ett Blackburn-arv, Jessica, ett äkta sådant, pågående. Den sista av Adelaide Blackburns gren dog nere i storstaden i våras, inga barn, inget testamente värt namnet, och lämnade efter sig en väldig röra. Vår borgmästare är från kusinsidan, den sida som fick näsan och inga pengar. Han är inte inblandad. Carter finns upptagen i bolagets rullor som den utredare de anställde för att kamma igenom det. Jag fick det från en bokhållare som bekräftade hela historien utan att en enda gång inse att hon bekräftade något. Han är precis, exakt det han sa till dig att han är. En snok med licens och ett representationskonto."</w:t>
+        <w:t>"Ett riktigt företag," sa hon innan jag ens hann få fram ett hej. "Gammalt, två delstater bort, gör det din herr Carter säger att det gör, bouppteckningar och dödsbon och efterforskning av förlorad egendom åt advokater som har mer pengar än tid. Och det finns ett Blackburn-arv, Jessica, ett äkta sådant, pågående. Den sista av Adelaide Blackburns gren dog nere i storstaden i våras, inga barn, inget testamente värt namnet, och lämnade efter sig en väldig röra. Vår borgmästare är från kusinsidan, den sida som fick näsan och inga pengar. Han är inte inblandad. Carter finns upptagen i bolagets rullor som den utredare de anställde för att kamma igenom det. Jag fick det från en bokhållare som bekräftade hela historien utan att en enda gång inse att hon bekräftade något. Han är precis, exakt det han sa till dig att han är. En snok med licens och ett representationskonto."</w:t>
       </w:r>
     </w:p>
     <w:p/>
@@ -4138,7 +4138,7 @@
     <w:p/>
     <w:p>
       <w:r>
-        <w:t>Jag satt med mappen uppslagen i händerna, och något vände sig långsamt om inuti mitt bröst. Det här förändrade formen på det hela. Den hemlighet som Fiona hade nästan tagit död på sig själv för att bevara, den skamliga stölden vid roten till hennes familj, såg annorlunda ut när man bredde ut papperen platt i ljuset. Det var en svår historia, och en mänsklig: en desperat flicka i ett kallt hus, och en skuld reglerad på det enda sätt som stod henne till buds. Berättad på ett sätt, i en viskning, med hälften av fakta, kunde den ruinera henne. Berättad på det sanna sättet, på hela sättet, med Neils dokument uppspridda under den, kanske den inte skulle ruinera henne alls. Det kunde till och med vara en historia som en kvinna kunde sträcka på sig inuti.</w:t>
+        <w:t>Jag satt med mappen uppslagen i händerna, och något vände sig långsamt om inuti mitt bröst. Det här förändrade formen på det hela. Den hemlighet som Fiona nästan hade tagit död på sig själv för att bevara, den skamliga stölden vid roten till hennes familj, såg annorlunda ut när man bredde ut papperen platt i ljuset. Det var en svår historia, och en mänsklig: en desperat flicka i ett kallt hus, och en skuld reglerad på det enda sätt som stod henne till buds. Berättad på ett sätt, i en viskning, med hälften av fakta, kunde den ruinera henne. Berättad på det sanna sättet, på hela sättet, med Neils dokument uppspridda under den, kanske den inte skulle ruinera henne alls. Det kunde till och med vara en historia som en kvinna kunde sträcka på sig inuti.</w:t>
       </w:r>
     </w:p>
     <w:p>
@@ -4247,7 +4247,7 @@
     <w:p/>
     <w:p>
       <w:r>
-        <w:t>Och kortet var i Theos hand.</w:t>
+        <w:t>Och kortet var skrivet med Theos handstil.</w:t>
       </w:r>
     </w:p>
     <w:p/>
@@ -4504,7 +4504,7 @@
     <w:p/>
     <w:p>
       <w:r>
-        <w:t>Det avgjorde varifrån bortom allt tvivel, och nästan vem. Det kändes kallt och tungt inom mig, eftersom jag redan visste, efter arkivet, vilkas händer de breven hade passerat igenom. Men när jag satt där i det kyliga lilla rummet fann jag något som inte stämde, och som inte ville lägga sig till rätta hur jag än vände på det.</w:t>
+        <w:t>Det avgjorde varifrån bortom allt tvivel, och nästan vem. Det kändes kallt och tungt inom mig, eftersom jag redan visste, efter arkivet, vems händer de breven hade passerat igenom. Men när jag satt där i det kyliga lilla rummet fann jag något som inte stämde, och som inte ville lägga sig till rätta hur jag än vände på det.</w:t>
       </w:r>
     </w:p>
     <w:p/>
@@ -4558,7 +4558,7 @@
     </w:p>
     <w:p>
       <w:r>
-        <w:t>Allmänningen hade förvandlats sedan morgonen. De långbord som vi hade burit ut och gjort i ordning var nu fyllda med stadens gåvor: Gretas pajer, hundra burkar inlagda grönsaker, fru Kims dumplings och ett helt bord med cirkelns vantar uppradade i storleksordning. På scenen i norra änden stod ett riktigt band, tre gubbar och en flicka med fiol, som spelade den sortens musik som fick till och med folk som svor på att de inte dansade att stampa takten med kängorna mot den kalla marken. Lyktor hängde i de nakna träden. Äppelmust- och kastanjebodar kantade hela allmänningen, och över alltihop lyste festivalbelysningen. Den sken i guld nu, varje slinga, stadigt och varmt. Inte en enda själ anmärkte på det, eftersom hela staden gemensamt, utan att säga ett enda ord, hade bestämt att ljusen alltid hade varit guldfärgade och därmed basta.</w:t>
+        <w:t>Allmänningen hade förvandlats sedan morgonen. De bockbord som vi hade burit ut och gjort i ordning var nu fyllda med stadens gåvor: Gretas pajer, hundra burkar sylt och marmelad, fru Kims dumplings och ett helt bord med cirkelns vantar uppradade i storleksordning. På scenen i norra änden stod ett riktigt band, tre gubbar och en flicka med fiol, som spelade den sortens musik som fick till och med folk som svor på att de inte dansade att stampa takten med kängorna mot den kalla marken. Lyktor hängde i de nakna träden. Äppelmust- och kastanjebodar kantade hela allmänningen, och över alltihop lyste festivalbelysningen. Den sken i guld nu, varje slinga, stadigt och varmt. Inte en enda själ anmärkte på det, eftersom hela staden gemensamt, utan att säga ett enda ord, hade bestämt att ljusen alltid hade varit guldfärgade och därmed basta.</w:t>
       </w:r>
     </w:p>
     <w:p>
@@ -4628,7 +4628,7 @@
     </w:p>
     <w:p>
       <w:r>
-        <w:t>Magin fanns överallt den dagen, på små sätt som staden bara kunde rycka på axlarna åt. När bandet spelade en reel gungade lyktorna i träden lite grann, trots att jag inte kunde känna någon vind. Isblommor växte upp på insidan av värdshusets fönster i mönster som var alldeles för vackra för att vara en tillfällighet, smälte och växte ut igen. Och under den sista timmen av dagsljus, när solen gick ner bakom kullarna och guldlyktorna kom till sin rätt, började det, helt stilla, att snöa för första gången sedan den vecka vi fann Snowball. Tjocka, långsamma flingor dalade ner över allmänningen, över bandet, bodarna och de uppvända ansiktena. Hela staden stannade upp på en gång, tittade upp och blev tyst.</w:t>
+        <w:t>Magin fanns överallt den dagen, på små sätt som staden bara kunde rycka på axlarna åt. När bandet spelade en reel gungade lyktorna i träden lite grann, trots att jag inte kunde känna någon vind. Isblommor växte upp på insidan av värdshusets fönster i mönster som var alldeles för vackra för att vara en tillfällighet, smälte och växte ut igen. Och under den sista timmen av dagsljus, när solen gick ner bakom kullarna och de gyllene festivalljusen kom till sin rätt, började det, helt stilla, att snöa för första gången sedan den vecka vi fann Snowball. Tjocka, långsamma flingor dalade ner över allmänningen, över bandet, bodarna och de uppvända ansiktena. Hela staden stannade upp på en gång, tittade upp och blev tyst.</w:t>
       </w:r>
     </w:p>
     <w:p>
@@ -4812,7 +4812,7 @@
     <w:p/>
     <w:p>
       <w:r>
-        <w:t>Hon hade läst den här. Hon hade haft framme det. Köpebrevet för värdshuset, papperet som dokumenterade köpet 1924, den halvan av hemligheten som inte fanns i ett enda Blackburn-brev och aldrig hade gjort det. Det hade varit i Vera Reeds händer, tillräckligt nyligen för att hon inte hunnit lägga undan det.</w:t>
+        <w:t>Hon hade läst den här. Hon hade haft det framme. Köpebrevet för värdshuset, papperet som dokumenterade köpet 1924, den halvan av hemligheten som inte fanns i ett enda Blackburn-brev och aldrig hade gjort det. Det hade varit i Vera Reeds händer, tillräckligt nyligen för att hon inte hunnit lägga undan det.</w:t>
       </w:r>
     </w:p>
     <w:p/>
@@ -4967,7 +4967,7 @@
     <w:p/>
     <w:p>
       <w:r>
-        <w:t>"Det är den svåraste vägen," sa Nick dämpat. "För dig framför allt. Staden kommer att sörja, Jess, och en del av dem kommer att önska att du hade låtit bli, och det är du som kommer att ha dragit sorgen över dem. De kommer att veta att det var du."</w:t>
+        <w:t>"Det är den svårare vägen," sa Nick dämpat. "För dig framför allt. Staden kommer att sörja, Jess, och en del av dem kommer att önska att du hade låtit bli, och det är du som kommer att ha dragit sorgen över dem. De kommer att veta att det var du."</w:t>
       </w:r>
     </w:p>
     <w:p/>
@@ -5309,7 +5309,7 @@
     <w:p/>
     <w:p>
       <w:r>
-        <w:t>Rummet blev tyst efter det, bortsett från gråten och de avlägsna ljuden av festivalen som packades ihop där ute. Två människor som hade gjort en grym sak av skäl de hade klätt i vackra ord tills de inte längre kunde se vad som fanns under, som satt nu i ruinerna av det och äntligen stod för det, högt och tydligt. Ingen fälla hade slagit igen. Ingen hade sträckt sig ut ur mörkret. Vi hade lagt det hela öppet och rent i ett varmt rum i eftermiddagsljuset och givit dem chansen att vara ärliga. De hade tagit den, eftersom de flesta, precis som Noriko hade sagt, till slut är dödströtta på att bära det.</w:t>
+        <w:t>Rummet blev tyst efter det, bortsett från gråten och de avlägsna ljuden av festivalen som packades ihop där ute. Två människor som hade gjort en grym sak av skäl de hade klätt i vackra ord tills de inte längre kunde se vad som fanns under, som nu satt i ruinerna av det och äntligen stod för det, högt och tydligt. Ingen fälla hade slagit igen. Ingen hade sträckt sig ut ur mörkret. Vi hade lagt det hela öppet och rent i ett varmt rum i eftermiddagsljuset och givit dem chansen att vara ärliga. De hade tagit den, eftersom de flesta, precis som Noriko hade sagt, till slut är dödströtta på att bära det.</w:t>
       </w:r>
     </w:p>
     <w:p/>
@@ -5344,7 +5344,7 @@
     <w:p/>
     <w:p>
       <w:r>
-        <w:t>Båda två hade erkänt det öppet i samma stund som de konfronterats, ingen av dem hade någon historik av oförrätter bakom sig, och kvinnan de hade gjort illa bad om upprättelse snarare än ruin. Så Noriko stakade ut en väg åt dem som varken var en fängelsecell eller en fri benådning.</w:t>
+        <w:t>Båda två hade erkänt det öppet i samma stund som de konfronterats, ingen av dem hade någon historik av oförrätter bakom sig, och kvinnan de hade gjort illa bad om gottgörelse snarare än ruin. Så Noriko stakade ut en väg åt dem som varken var en fängelsecell eller en fri benådning.</w:t>
       </w:r>
     </w:p>
     <w:p/>
@@ -5362,7 +5362,7 @@
     <w:p/>
     <w:p>
       <w:r>
-        <w:t>För Veras del innebar det att betala tillbaka vad hon kunde, på avbetalningar som hon skulle känna i märgen varje månad, en lång tid av övervakning och att lämna borgmästarens kontor. Hon avgick veckan därpå. Det var det rätta att göra och det kostade henne mycket, för trots att borgmästaren underbetalade henne hade det skrivbordet varit hennes plats i den här staden i femton år. Det tyngde mig. Det var jag som hade ställt till det. Det hade ett verkligt pris, och jag såg till att titta rakt på det i stället för att vända blicken bort.</w:t>
+        <w:t>För Veras del innebar det att betala tillbaka vad hon kunde, på avbetalningar som hon skulle känna i märgen varje månad, en lång tid av övervakning och att lämna borgmästarens kontor. Hon avgick veckan därpå. Det var det rätta att göra och det kostade henne mycket, för trots att borgmästaren underbetalade henne hade det skrivbordet varit hennes plats i den här staden i femton år. Det tyngde mig. Det var jag som hade orsakat det. Det hade ett verkligt pris, och jag såg till att titta rakt på det i stället för att vända blicken bort.</w:t>
       </w:r>
     </w:p>
     <w:p/>
@@ -5398,7 +5398,7 @@
     <w:p/>
     <w:p>
       <w:r>
-        <w:t>Det Fiona gav Theo var svårare än en förlåtelse och långt bättre. Hon gav honom den långa vägen tillbaka, och sin tro på att han kunde vandra den. Det tvingade honom att möta hela tyngden av det han hade gjort, och sedan satte det en skyffel i hans händer i stället för att ge honom ett straff.</w:t>
+        <w:t>Det Fiona gav Theo var svårare än en benådning och långt bättre. Hon gav honom den långa vägen tillbaka, och sin tro på att han kunde vandra den. Det tvingade honom att möta hela tyngden av det han hade gjort, och sedan satte det en skyffel i hans händer i stället för att ge honom ett straff.</w:t>
       </w:r>
     </w:p>
     <w:p/>
@@ -5450,7 +5450,7 @@
     </w:p>
     <w:p>
       <w:r>
-        <w:t>De hade förstås hört talas om det. Ingenting sådant förblev hemligt i Frost Falls särskilt mycket längre än en förmiddag. De välpolerade, vänliga makarna Worthington hade, med hjälp av festivalens sorl och värdshusets tystnad, lagt pusslet och förstått att Historiska sällskapet befann sig i djupt ekonomiskt trångmål och att dessa bekymmer hade drivit en hederlig man till en dålig handling. Herr Worthington hittade mig på värdshusets veranda på deras sista morgon, med sin fru vid sin sida i krämfärgad kashmir och med sin fina kappa över armen, och han kom direkt till sak med den lätthet som är utmärkande för någon som aldrig behövt fundera över hur man skaffar pengar.</w:t>
+        <w:t>De hade förstås hört talas om det. Ingenting sådant förblev hemligt i Frost Falls särskilt mycket längre än en förmiddag. De välpolerade, vänliga makarna Worthington hade, med hjälp av festivalens sorl och värdshusets tystnad, lagt pusslet och förstått att Historiska sällskapet befann sig i djupt ekonomiskt trångmål och att dessa bekymmer hade drivit en hederlig man till en dålig handling. Herr Worthington hittade mig på värdshusets veranda på deras sista morgon, med sin fru vid sin sida, hon i krämfärgad kashmir och med sin fina kappa över armen, och han kom direkt till sak med den lätthet som är utmärkande för någon som aldrig behövt fundera över hur man skaffar pengar.</w:t>
       </w:r>
     </w:p>
     <w:p>
@@ -5485,7 +5485,7 @@
     </w:p>
     <w:p>
       <w:r>
-        <w:t>"Den här staden har just drabbats av något fult," sa jag, "därför att en god man bestämde sig för att räddningen av sällskapet helgade medlen, att en räddningsaktion var värd en oförrätt, att slutet skulle ursäkta medlen. Nåväl. Om sällskapet räddas nästa vecka med hjälp av en tillfällig främlings checkhäfte, hur välmenat det än är, så blir den tysta lärdom som hela staden drar att Theo hade rätt åtminstone på en punkt. Att byggnadens överlevnad är något som kommer utifrån, genom pengar, genom en genväg, genom en välgörare, och inte något som staden själv måste vilja ha, arbeta för och förtjäna." Jag skakade på huvudet. "Ett sällskap som räddas av en generös gäst är bara uppskjutet, herr Worthington. Om fem år står det i samma grop igen och väntar på att nästa rika besökare ska fatta tycke för lapptäckena. Det enda sättet som stället någonsin blir genuint tryggt på är om Frost Falls själv bestämmer sig för att det är värt att rädda, och räddar det med egna händer, ur egna fickor, hur skrala de än är. Det tar längre tid. Det är bra mycket svårare. Men det är den varianten som håller i längden, och det läker det som nyss hände här i stället för att bara klistra upp en munter affisch över det hela."</w:t>
+        <w:t>"Den här staden har just drabbats av något fult," sa jag, "därför att en god man bestämde sig för att räddningen av sällskapet rättfärdigade vad som helst, att en räddningsaktion var värd en oförrätt, att målet skulle ursäkta medlen. Nåväl. Om sällskapet räddas nästa vecka med hjälp av en tillfällig främlings checkhäfte, hur välmenat det än är, så blir den tysta lärdom som hela staden drar att Theo hade rätt åtminstone på en punkt. Att byggnadens överlevnad är något som kommer utifrån, genom pengar, genom en genväg, genom en välgörare, och inte något som staden själv måste vilja ha, arbeta för och förtjäna." Jag skakade på huvudet. "Ett sällskap som räddas av en generös gäst är bara uppskjutet, herr Worthington. Om fem år står det i samma grop igen och väntar på att nästa rika besökare ska fatta tycke för lapptäckena. Det enda sättet som stället någonsin blir genuint tryggt på är om Frost Falls själv bestämmer sig för att det är värt att rädda, och räddar det med egna händer, ur egna fickor, hur skrala de än är. Det tar längre tid. Det är bra mycket svårare. Men det är den varianten som håller i längden, och det läker det som nyss hände här i stället för att bara klistra upp en munter affisch över det hela."</w:t>
       </w:r>
     </w:p>
     <w:p>
@@ -5551,7 +5551,7 @@
     <w:p/>
     <w:p>
       <w:r>
-        <w:t>Jag trodde att Fiona ville begrava hemligheten djupare än någonsin nu när den nästan hade ödelagt henne. Jag borde ha vetat bättre. I stället gjorde hon det modigaste jag såg någon göra under hela den här historien, modigare än att möta Theo tvärs över det lilla sällskapsrummet. Hon bestämde sig för att berätta den.</w:t>
+        <w:t>Jag trodde att Fiona skulle vilja begrava hemligheten djupare än någonsin nu när den nästan hade ödelagt henne. Jag borde ha vetat bättre. I stället gjorde hon det modigaste jag såg någon göra under hela den här historien, modigare än att möta Theo tvärs över det lilla sällskapsrummet. Hon bestämde sig för att berätta den.</w:t>
       </w:r>
     </w:p>
     <w:p/>
@@ -5593,7 +5593,7 @@
     <w:p/>
     <w:p>
       <w:r>
-        <w:t>Claire skrev den med värme, eftersom Claire var snäll, och eftersom sanningen visade sig vara god när man väl berättade den i sin helhet i stället för den värsta hälften. Texten publicerades på en torsdag, över hela framsidan av inlagan. Självklart pratade folk. De hade pratat om vädret om inget annat fanns. Men de pratade inte som Fiona hade tillbringat hela sitt liv med att fasa för att de skulle göra. Ingen ryggade tillbaka. Ingen tittade snett på henne över bageridisken. Mest vävde de in det i allt de visste om sitt eget folk, som hade kämpat, misstagit sig och uthärdat. Hälften av dem hade en gammelmormor som gjort någonting tyst och desperat under en hård vinter en gång.</w:t>
+        <w:t>Claire skrev den med värme, eftersom Claire var snäll, och eftersom sanningen visade sig vara god när man väl berättade den i sin helhet i stället för den värsta hälften. Texten publicerades på en torsdag, över hela framsidan av inlagan. Självklart pratade folk. De hade pratat om vädret om inget annat fanns. Men de pratade inte som Fiona hade tillbringat hela sitt liv med att fasa för att de skulle göra. Ingen ryggade tillbaka. Ingen tittade snett på henne över bageridisken. Mest vävde de in det i allt de visste om sitt eget folk, som hade kämpat, felat och uthärdat. Hälften av dem hade en gammelmormor som gjort någonting tyst och desperat under en hård vinter en gång.</w:t>
       </w:r>
     </w:p>
     <w:p/>
@@ -5623,13 +5623,13 @@
     <w:p/>
     <w:p>
       <w:r>
-        <w:t>Jag hade stålsatt mig för att bli outsidern som krossade en hederlig man. Jag hade mer än till hälften väntat mig att staden skulle svalna mot mig, att önska att jag hade låtit det bero, att komma ihåg, varje gång de såg på mig, att jag var den som dragit fram Theo Hussein i ljuset och vållat stadens sorg. Och det fanns lite av den varan, här och där, ett tag. Några som inte riktigt kunde möta min blick, som blev lite tysta när jag kom in i en butik. Jag förstod det och lät det bero. Jag pressade inte på.</w:t>
-      </w:r>
-    </w:p>
-    <w:p/>
-    <w:p>
-      <w:r>
-        <w:t>Men mest hände det motsatta. Folk började, i det tysta, på omvägar, som den här staden gjorde sina djupaste saker, att komma fram och tacka mig. Dot tryckte en burk med sina inlagda frukter i mina händer på marknaden och sa, buttert, med blicken fäst på äpplena och inte på mig:</w:t>
+        <w:t>Jag hade stålsatt mig för att bli den utomstående som krossade en hederlig man. Jag hade mer än till hälften väntat mig att staden skulle svalna mot mig, önska att jag hade låtit det bero, komma ihåg, varje gång de såg på mig, att jag var den som dragit fram Theo Hussein i ljuset och vållat stadens sorg. Och det fanns lite av den varan, här och där, ett tag. Några som inte riktigt kunde möta min blick, som blev lite tysta när jag kom in i en butik. Jag förstod det och lät det bero. Jag pressade inte på.</w:t>
+      </w:r>
+    </w:p>
+    <w:p/>
+    <w:p>
+      <w:r>
+        <w:t>Men mest hände det motsatta. Folk började, i det tysta, på omvägar, som den här staden gjorde sina djupaste saker, att komma fram och tacka mig. Dot tryckte en burk med sin hemkokta sylt i mina händer på marknaden och sa, buttert, med blicken fäst på äpplena och inte på mig:</w:t>
       </w:r>
     </w:p>
     <w:p/>
@@ -5833,7 +5833,7 @@
     </w:p>
     <w:p>
       <w:r>
-        <w:t>"Det är hela staden också," sa jag. "Det är ju lite det som är meningen med det. Det är en anledning att fortsätta genom de mörka månaderna. Någonting bra som väntar i andra änden av vintern."</w:t>
+        <w:t>"Det kommer hela staden att vara också," sa jag. "Det är ju lite det som är meningen med det. Det är en anledning att fortsätta genom de mörka månaderna. Någonting bra som väntar i andra änden av vintern."</w:t>
       </w:r>
     </w:p>
     <w:p>
@@ -5878,7 +5878,7 @@
     </w:p>
     <w:p>
       <w:r>
-        <w:t>Järneken stod i den, kvisten från pumpan, stående i några centimeters vatten. De tre bladen var mörka och glansiga, och bären var lika röda som den eftermiddag den kom upp.</w:t>
+        <w:t>Järneken stod i den, kvisten från pumpan, i några centimeters vatten. De tre bladen var mörka och glansiga, och bären var lika röda som den eftermiddag den kom upp.</w:t>
       </w:r>
     </w:p>
     <w:p>
@@ -6071,7 +6071,7 @@
     </w:p>
     <w:p>
       <w:r>
-        <w:t>Staden griper efter de enkla namnen: slaktaren som kedjade fast grinden till lastgården, familjen som låg efter med oljan, en uttråkad grabb med en stulen sprayburk. Jessica sträcker sig efter det som passar – för den som gjorde det här köpte pulvret, kände till dosen och lämnade in ett klagomål som citerade hälsovårdsföreskrifterna ända ner till underparagraf. Det där är inget raseriutbrott. Det är ett yrke.</w:t>
+        <w:t>Staden griper efter de enkla namnen: slaktaren som kedjade fast grinden till lastgården, familjen som ligger efter med oljan, en uttråkad grabb med en stulen sprayburk. Jessica sträcker sig efter det som passar – för den som gjorde det här köpte pulvret, kände till dosen och lämnade in ett klagomål som citerade hälsovårdsföreskrifterna ända ner till underparagraf. Det där är inget raseriutbrott. Det är ett yrke.</w:t>
       </w:r>
     </w:p>
     <w:p>
@@ -6128,7 +6128,7 @@
     </w:p>
     <w:p>
       <w:r>
-        <w:t>Varje kvinna i cirkeln hade med sig sin egen ädelgran, och jag hade tagit med Nordpolens sätt att binda den, vilket Olivia hade svurit på att stjäla från mig före jul. Jag fäste ståltråden vid stommen långsamt, så att alla kunde följa med. Först därefter sträckte jag mig efter den första näven gran. Doften slog emot mig, kall och grön, tillräckligt skarp för att rensa huvudet. Den fyllde det främre rummet i Yarn Tales på ett sätt som butikens egen ull aldrig riktigt lyckades med. Jag satt där med kåda på fingrarna och en naken stomme i knät, en av sju kvinnor som var böjda över samma arbete. Det finns sämre sätt att tillbringa novembres första lediga morgon.</w:t>
+        <w:t>Varje kvinna i cirkeln hade med sig sin egen ädelgran, och jag hade tagit med Nordpolens sätt att binda den, vilket Olivia hade svurit på att stjäla från mig före jul. Jag fäste ståltråden vid stommen långsamt, så att alla kunde följa med. Först därefter sträckte jag mig efter den första näven gran. Doften slog emot mig, kall och grön, tillräckligt skarp för att rensa huvudet. Den fyllde det främre rummet i Yarn Tales på ett sätt som butikens egen ull aldrig riktigt lyckades med. Jag satt där med kåda på fingrarna och en naken stomme i knät, en av sju kvinnor som var böjda över samma arbete. Det finns sämre sätt att tillbringa novembers första lediga morgon.</w:t>
       </w:r>
     </w:p>
     <w:p>

</xml_diff>